<commit_message>
Tau: cover letters reflect the unified 5O3L docking numbers
The submission-package cover letters now cite the single reproducible 5O3L
docking run (-3.8 to -6.8 kcal/mol, mean -4.7) and the docking Q2_CV = 0.35
(~0.15 under a stricter Y-scrambled protocol) alongside the unchanged
physisorption Q2_CV = 0.06. Date bumped to 2026-09-09.

Co-Authored-By: Claude Sonnet 5 <noreply@anthropic.com>
</commit_message>
<xml_diff>
--- a/manuscript/submission_ready/01_Cover_Letter_Beilstein_Tau.docx
+++ b/manuscript/submission_ready/01_Cover_Letter_Beilstein_Tau.docx
@@ -18,7 +18,7 @@
         <w:br/>
         <w:t>Email: andres.monreal@ues.mx | ORCID: 0009-0009-1207-8597</w:t>
         <w:br/>
-        <w:t>Date: August 30, 2026</w:t>
+        <w:t>Date: September 9, 2026</w:t>
         <w:br/>
       </w:r>
     </w:p>
@@ -76,7 +76,7 @@
     </w:p>
     <w:p>
       <w:r>
-        <w:t>We screened 29 Alzheimer's / Tau-directed therapeutics against a pristine beta-12 borophene cluster with GFN2-xTB, relaxing every drug-surface complex, and combined this with real AutoDock Vina docking against the cryo-EM Tau filament core (PDB 5O3L) and a leak-free nested cross-validated surrogate. The central result is that pristine beta-12 borophene is not an inert physisorptive carrier for this chemotype: 12 of the 29 ligands chemisorb, forming a covalent B-C or B-O bond (Delta_E_int,SP = -81 to -233 kcal/mol), while the remaining 17 physisorb at -8 to -44 kcal/mol. A descriptor-based QSPR of the physisorption energy is not predictive (Q2_CV = 0.06), so the model-free chemisorption/physisorption dichotomy is the contribution. A peptide-functionalized borophene is discussed only as future work. Every value in the manuscript is computed from the deposited pipeline; no descriptor or energy is estimated from an empirical formula.</w:t>
+        <w:t>We screened 29 Alzheimer's / Tau-directed therapeutics against a pristine beta-12 borophene cluster with GFN2-xTB, relaxing every drug-surface complex, and combined this with a single reproducible AutoDock Vina docking run against the cryo-EM Tau filament core (PDB 5O3L; scores -3.8 to -6.8 kcal/mol, mean -4.7) and a leak-free nested cross-validated surrogate. The central result is that pristine beta-12 borophene is not an inert physisorptive carrier for this chemotype: 12 of the 29 ligands chemisorb, forming a covalent B-C or B-O bond (Delta_E_int,SP = -81 to -233 kcal/mol), while the remaining 17 physisorb at -8 to -44 kcal/mol. Descriptor-based QSPR is weak for both endpoints (Q2_CV = 0.06 for the physisorption energy; 0.35 for the filament docking score, falling to about 0.15 under a stricter Y-scrambled protocol), so the model-free chemisorption/physisorption dichotomy is the contribution. A peptide-functionalized borophene is discussed only as future work. Every value in the manuscript is computed from the deposited pipeline; no descriptor or energy is estimated from an empirical formula.</w:t>
       </w:r>
     </w:p>
     <w:p>

</xml_diff>

<commit_message>
Add Zenodo DOI to the Beilstein cover letter
The Beilstein cover letter never mentioned the archival DOI (only the
Molecular Diversity one did). Added a reproducibility sentence citing
10.5281/zenodo.22187834 and regenerated the submission package.

Co-Authored-By: Claude Sonnet 5 <noreply@anthropic.com>
</commit_message>
<xml_diff>
--- a/manuscript/submission_ready/01_Cover_Letter_Beilstein_Tau.docx
+++ b/manuscript/submission_ready/01_Cover_Letter_Beilstein_Tau.docx
@@ -77,6 +77,11 @@
     <w:p>
       <w:r>
         <w:t>We screened 29 Alzheimer's / Tau-directed therapeutics against a pristine beta-12 borophene cluster with GFN2-xTB, relaxing every drug-surface complex, and combined this with a single reproducible AutoDock Vina docking run against the cryo-EM Tau filament core (PDB 5O3L; scores -3.8 to -6.8 kcal/mol, mean -4.7) and a leak-free nested cross-validated surrogate. The central result is that pristine beta-12 borophene is not an inert physisorptive carrier for this chemotype: 12 of the 29 ligands chemisorb, forming a covalent B-C or B-O bond (Delta_E_int,SP = -81 to -233 kcal/mol), while the remaining 17 physisorb at -8 to -44 kcal/mol. Descriptor-based QSPR is weak for both endpoints (Q2_CV = 0.06 for the physisorption energy; 0.35 for the filament docking score, falling to about 0.15 under a stricter Y-scrambled protocol), so the model-free chemisorption/physisorption dichotomy is the contribution. A peptide-functionalized borophene is discussed only as future work. Every value in the manuscript is computed from the deposited pipeline; no descriptor or energy is estimated from an empirical formula.</w:t>
+      </w:r>
+    </w:p>
+    <w:p>
+      <w:r>
+        <w:t>The complete open-source pipeline, curated dataset and figure generators are archived at Zenodo (DOI: 10.5281/zenodo.22187834), fully reproducing every value and figure in the manuscript.</w:t>
       </w:r>
     </w:p>
     <w:p>

</xml_diff>